<commit_message>
Reconcile final report findings and synchronise README with approved PDF
</commit_message>
<xml_diff>
--- a/reports/final/Group_10_Final_Report.docx
+++ b/reports/final/Group_10_Final_Report.docx
@@ -52,7 +52,7 @@
         <w:spacing/>
       </w:pPr>
       <w:r>
-        <w:t>Melbourne’s small and medium-sized enterprises (SMEs) have regained establishments since 2022, yet some precinct–industry groups continue to shrink. The Lord Mayor needs to identify where business support deserves attention. City-wide growth alone offers little guidance when local industries are moving in different directions.</w:t>
+        <w:t>Melbourne’s small and medium-sized enterprises (SMEs) have regained establishments since 2022, yet some precinct–industry groups continue to shrink. The Lord Mayor needs to decide where business consultation and support deserve priority. City-wide growth can conceal losses among the smaller operators these measures are intended to reach.</w:t>
       </w:r>
     </w:p>
     <w:p>
@@ -61,7 +61,7 @@
         <w:spacing/>
       </w:pPr>
       <w:r>
-        <w:t>The City’s Economic Development Strategy 2031 links reduced office attendance and visitor activity to disrupted demand (City of Melbourne, 2021, pp. 12–14). Using Census of Land Use and Employment (CLUE) data, we examine five groups with persistent losses and compare their recovery with industry peers.</w:t>
+        <w:t>The City’s Economic Development Strategy 2031 links reduced office attendance and visitor activity to disrupted demand (City of Melbourne, 2021, pp. 12–14). Using Census of Land Use and Employment (CLUE) data, we examine persistent shortfalls and compare local recovery with industry peers.</w:t>
       </w:r>
     </w:p>
     <w:p>
@@ -92,7 +92,7 @@
         <w:spacing/>
       </w:pPr>
       <w:r>
-        <w:t>We measure losses against 2019 and recovery since 2022, selecting cases by the scale and persistence of decline. Same-industry comparisons distinguish local underperformance from wider sector weakness. Forecast tests assess whether historical counts can guide future priorities.</w:t>
+        <w:t>Our objectives are to measure remaining losses against 2019 and recovery since 2022, identify groups with substantial continuing declines, and test whether forecasts improve decision support. Same-industry comparisons distinguish local underperformance from broader sector weakness.</w:t>
       </w:r>
     </w:p>
     <w:tbl>
@@ -485,7 +485,7 @@
         <w:widowControl/>
       </w:pPr>
       <w:r>
-        <w:t>The aggregated CLUE file contains 13,353 rows and six variables: year, precinct, industry, business size, establishment count and job count (City of Melbourne, n.d.-a). Each row is a year–precinct–industry–size combination. Selecting Small and Medium retains 8,800 rows. The address file has 413,550 records but no size field, so it supports all-size checks (City of Melbourne, n.d.-b).</w:t>
+        <w:t>The aggregated CLUE file contains 13,353 rows and six variables: year, precinct, industry, business size, establishment count and job count (City of Melbourne, n.d.-a). Each row represents a year–precinct–industry–size combination. Selecting Small and Medium retains 8,800 rows. The 413,550-record address file has no size field and supports all-size cross-checks (City of Melbourne, n.d.-b).</w:t>
       </w:r>
     </w:p>
     <w:p>
@@ -493,7 +493,7 @@
         <w:widowControl/>
       </w:pPr>
       <w:r>
-        <w:t>We checked types, missingness, duplicate keys and invalid counts. Establishment counts are complete. Jobs are missing in 4,252 rows (31.8%), all containing at most two establishments, consistent with confidentiality suppression. Retaining these rows, including 1,932 SME rows, preserves establishment coverage without job imputation.</w:t>
+        <w:t>We standardised names and types and checked missingness, duplicate keys and invalid counts. Establishment counts are complete. Jobs are missing in 4,252 rows (31.8%), all containing at most two establishments, consistent with confidentiality suppression. We retained these rows without imputing jobs, preserving establishment coverage.</w:t>
       </w:r>
     </w:p>
     <w:p>
@@ -501,7 +501,7 @@
         <w:widowControl/>
       </w:pPr>
       <w:r>
-        <w:t>The address file includes 68,299 Vacant Space observations across all years. These are a recorded category, not missing values. We retain them in source data but exclude them when checking operating-establishment totals. The aggregated SME file has no vacancy category.</w:t>
+        <w:t>The address file’s 68,299 Vacant Space observations are a recorded category, not missing values. They remain in source data and are excluded only from operating-establishment cross-checks. The aggregated SME file has no vacancy category.</w:t>
       </w:r>
     </w:p>
     <w:p>
@@ -509,7 +509,7 @@
         <w:widowControl/>
       </w:pPr>
       <w:r>
-        <w:t>Group totals reconcile to city totals. Unpublished cells remain unknown: 206 groups have complete counts for 2019, 2022 and 2024; 11 are incomplete. Appendix B shows precinct and industry detail.</w:t>
+        <w:t>Group totals reconcile to city totals. Descriptive comparisons use 206 groups observed in 2019, 2022 and 2024; 100 had fewer than 20 establishments in 2019. Prediction requires 2020, 2022 and 2024 counts for its lag, starting level and target (207 groups). Unpublished cells remain unknown. Appendix B shows geographic and industry distributions. This uneven size distribution makes both absolute losses and proportional change useful, while discouraging rankings driven by tiny baselines.</w:t>
       </w:r>
     </w:p>
     <w:p>
@@ -529,7 +529,7 @@
         <w:widowControl/>
       </w:pPr>
       <w:r>
-        <w:t>R and R Markdown reproduce the checks, tables and ggplot2 figures. We compare 2019–2024 shortfalls and 2022–2024 recovery. CLUE surveys properties at least once every two years, supporting multi-year comparisons (City of Melbourne, n.d.-c). Predictive observations use even-year origins, 2004–2022, creating non-overlapping two-year windows.</w:t>
+        <w:t>R and R Markdown reproduce checks, tables and ggplot2 figures. We compare 2019–2024 shortfalls and 2022–2024 recovery. CLUE’s two-year property survey cycle supports multi-year comparisons (City of Melbourne, n.d.-c). Even-year predictive origins, 2004–2022, give non-overlapping two-year change windows; they do not make repeated groups independent.</w:t>
       </w:r>
     </w:p>
     <w:p>
@@ -537,7 +537,7 @@
         <w:widowControl/>
       </w:pPr>
       <w:r>
-        <w:t>We screen for 2024 counts below both 2019 and 2022, then select the four largest historical shortfalls among groups declining at least 2% after 2022. Adding the non-CBD hospitality group with the largest shortfall among continuing declines provides a contrast within a recovering industry.</w:t>
+        <w:t>We flag counts below both 2019 and 2022, then select the four largest historical shortfalls among groups declining at least 2% after 2022. This focuses on material continuing declines. The non-CBD hospitality group with the largest shortfall among continuing declines adds a contrast within a recovering industry.</w:t>
       </w:r>
     </w:p>
     <w:p>
@@ -545,7 +545,7 @@
         <w:widowControl/>
       </w:pPr>
       <w:r>
-        <w:t>Peers are the same industry outside each case’s precinct. Starting count multiplied by one plus peer growth gives a benchmark; its gap from the observed count measures relative performance. Earlier comparisons, alternative decline cutoffs and a 2018 baseline test the findings.</w:t>
+        <w:t>Peers are the same industry outside each case’s precinct. Starting count multiplied by one plus peer growth gives a benchmark for relative performance. Earlier periods, alternative decline cutoffs and a 2018 baseline test the comparisons and case selection.</w:t>
       </w:r>
     </w:p>
     <w:p>
@@ -553,7 +553,7 @@
         <w:widowControl/>
       </w:pPr>
       <w:r>
-        <w:t>Models predict two-year changes using current count, log(1 + count), previous two-year change, precinct and industry. Multiple linear regression (OLS) provides an interpretable starting point; a pruned regression tree allows thresholds and interactions; gradient boosting tests more flexible relationships. No-change carries forward the latest count, predicting zero change (Hyndman &amp; Athanasopoulos, 2021).</w:t>
+        <w:t>Models predict two-year changes using current count, log(1 + count), previous change, precinct and industry. Modelling change focuses on growth beyond the starting level. Linear regression (OLS) tests linear relationships; a pruned regression tree captures thresholds and interactions; gradient boosting tests greater flexibility. No-change carries the latest count forward, predicting zero change (Hyndman &amp; Athanasopoulos, 2021).</w:t>
       </w:r>
     </w:p>
     <w:p>
@@ -561,7 +561,7 @@
         <w:widowControl/>
       </w:pPr>
       <w:r>
-        <w:t>Four expanding-window folds predict 2016, 2018, 2020 and 2022 using outcomes available at each origin. We select configurations by average validation mean absolute error (MAE). Root mean squared error (RMSE) gives larger errors more weight. The separate 2022–2024 test uses 207 common groups, covering over 99.9% of city counts. Checks by group size and city total assess practical usefulness.</w:t>
+        <w:t>We assume comparable classifications and test whether historical relationships carry forward. Four expanding-window folds predict 2016, 2018, 2020 and 2022. Mean absolute error (MAE), averaged across folds, selects configurations before the separate 2022–2024 test. Root mean squared error (RMSE) gives large errors more weight. The 207 test groups cover over 99.9% of city counts; group-size and aggregate errors assess decision usefulness.</w:t>
       </w:r>
     </w:p>
     <w:p>
@@ -670,7 +670,7 @@
         <w:widowControl/>
       </w:pPr>
       <w:r>
-        <w:t>All 13 precincts remain below 2019; eight grew after 2022. The CBD added 245 establishments, half the recent city gain, but holds 1,594 of the 2,452 remaining shortfall. East Melbourne has the largest percentage gap (20.0%). The CBD therefore dominates the scale of loss without having the steepest proportional decline.</w:t>
+        <w:t>All 13 precincts remain below 2019; eight grew after 2022. The CBD added 245 establishments, half the city gain, yet holds 1,594 of the remaining 2,452 shortfall. East Melbourne has the largest percentage gap (20.0%), distinguishing proportional decline from the CBD’s larger absolute loss.</w:t>
       </w:r>
     </w:p>
     <w:p>
@@ -678,7 +678,7 @@
         <w:widowControl/>
       </w:pPr>
       <w:r>
-        <w:t>Applying outside-CBD industry growth rates to its 2019 counts gives a 2024 benchmark of 7,663, against 7,485 observed. About 89% of its historical fall matches the decline implied by those rates. Much of the CBD’s shortfall thus reflects weakness shared by its industries elsewhere.</w:t>
+        <w:t>Applying outside-CBD industry growth rates to its 2019 counts gives a benchmark of 7,663 against 7,485 observed in 2024. About 89% of the CBD’s fall matches the decline implied by these rates, showing substantial weakness shared with its industries elsewhere.</w:t>
       </w:r>
     </w:p>
     <w:p>
@@ -699,7 +699,7 @@
         <w:widowControl/>
       </w:pPr>
       <w:r>
-        <w:t>Professional services and retail account for 1,057 lost establishments since 2019. After 2022, professional services lost another 26 while retail gained 76. Professional services, finance and administration together represent 48% of the city’s historical net loss, making service-sector recovery central to closing the gap.</w:t>
+        <w:t>Professional services, finance and administration account for 48% of the historical net loss and continued to decline after 2022. Professional services lost another 26 establishments, while retail regained 76. Historical shortfalls therefore do not always signal continuing deterioration.</w:t>
       </w:r>
     </w:p>
     <w:p>
@@ -707,7 +707,7 @@
         <w:widowControl/>
       </w:pPr>
       <w:r>
-        <w:t>Hospitality supplied 214 establishments, or 44% of the recent net gain. Across industries, gains of 601 were offset by losses of 118. The recovery therefore depends heavily on expansion in a few sectors while others continue to contract.</w:t>
+        <w:t>Hospitality added 214 establishments, 44% of the recent net gain. Across industries, gains of 601 were offset by losses of 118. Recovery is concentrated in growing sectors while several service industries continue to shrink.</w:t>
       </w:r>
     </w:p>
     <w:p>
@@ -728,7 +728,7 @@
         <w:widowControl/>
       </w:pPr>
       <w:r>
-        <w:t>The screen identifies 64 groups with historical shortfalls and recent declines; 53 had fewer than 100 establishments in at least one baseline year. The five cases account for 876 lost establishments since 2019, or 35.7% of the city’s remaining shortfall (Table 2).</w:t>
+        <w:t>The screen flags 64 groups; 53 had fewer than 100 establishments in at least one baseline year. Our five cases account for 876 lost establishments since 2019, or 35.7% of the city’s shortfall (Table 2).</w:t>
       </w:r>
     </w:p>
     <w:p>
@@ -736,7 +736,7 @@
         <w:widowControl/>
       </w:pPr>
       <w:r>
-        <w:t>These cases lost another 114 establishments after 2022 while all other groups gained a net 597. Continuing losses amid city-wide growth strengthen their priority for investigation.</w:t>
+        <w:t>These cases lost another 114 establishments after 2022 while all other groups gained 597. CBD health care fell only 0.9%, below our 2% cutoff; Southbank adds a non-CBD comparison. CBD retail illustrates the distinction: despite a 298-establishment historical shortfall, it added 37 after 2022 and is excluded. Historical scale alone therefore does not determine the shortlist.</w:t>
       </w:r>
     </w:p>
     <w:p>
@@ -800,7 +800,7 @@
         <w:widowControl/>
       </w:pPr>
       <w:r>
-        <w:t>Professional services, construction and Southbank hospitality show weaker recovery than their industry peers (Figure 3).</w:t>
+        <w:t>Figure 3 compares each case with its industry peers.</w:t>
       </w:r>
     </w:p>
     <w:tbl>
@@ -2128,7 +2128,7 @@
         <w:widowControl/>
       </w:pPr>
       <w:r>
-        <w:t>CBD professional services has the largest shortfall: 450 establishments, including 428 Small establishments. Its recent decline of 3.3% contrasts with peer growth of 2.8%. CBD construction fell 13.5% while peers grew 13.9%; its entire historical shortfall of 45 is in the Small category. Matching peer growth would leave these groups roughly 84 and 30 establishments above their observed counts, respectively.</w:t>
+        <w:t>CBD professional services has the largest shortfall: 450 establishments, including 428 Small establishments. Its recent decline of 3.3% contrasts with peer growth of 2.8%. CBD construction fell 13.5% against peer growth of 13.9%; its entire historical loss of 45 is in the Small category.</w:t>
       </w:r>
     </w:p>
     <w:p>
@@ -2136,7 +2136,7 @@
         <w:widowControl/>
       </w:pPr>
       <w:r>
-        <w:t>Southbank hospitality fell 4.7% while peers grew 9.0%. Excluding the CBD still leaves peer growth of 4.7%, so the contrast extends beyond one large precinct. Its benchmark is 231 establishments, 29 above the observed 202. Local trading conditions deserve attention within an otherwise recovering industry.</w:t>
+        <w:t>Southbank hospitality fell 4.7% while peers grew 9.0%. Excluding the CBD still leaves peer growth of 4.7%, extending the contrast beyond one large precinct. Its weakness warrants local investigation within a recovering industry.</w:t>
       </w:r>
     </w:p>
     <w:p>
@@ -2144,7 +2144,7 @@
         <w:widowControl/>
       </w:pPr>
       <w:r>
-        <w:t>CBD finance and administration fell 3.6% and 9.9%, while peers fell faster: 10.3% and 13.3%. Their losses matter, but the wider sector decline changes the diagnosis. Finance’s Small category lost 204 establishments from 2019 while Medium gained 19, directing attention to smaller operators within that sector.</w:t>
+        <w:t>CBD finance and administration fell 3.6% and 9.9%, while peers fell faster: 10.3% and 13.3%. Wider sector decline matters here. Finance’s Small category lost 204 establishments from 2019 while Medium gained 19, concentrating the historical loss among smaller operators.</w:t>
       </w:r>
     </w:p>
     <w:p>
@@ -2164,7 +2164,7 @@
         <w:widowControl/>
       </w:pPr>
       <w:r>
-        <w:t>CBD professional services already lagged peers in 2017–2019: it fell 3.5% while peers grew 2.9%. Underperformance was visible before the pandemic. Southbank hospitality grew 14.6% against peers’ 3.2% before the pandemic, then declined as peers recovered. These cases suggest different questions: recurring location pressures versus a reversal in local trading conditions (Figure A1).</w:t>
+        <w:t>CBD professional services already lagged peers in 2017–2019: it fell 3.5% while peers grew 2.9%. Southbank hospitality then grew 14.6% against peers’ 3.2%, before declining during the recent recovery. Figure A1 distinguishes weakness visible before COVID from a reversal in local performance.</w:t>
       </w:r>
     </w:p>
     <w:p>
@@ -2184,7 +2184,7 @@
         <w:widowControl/>
       </w:pPr>
       <w:r>
-        <w:t>The four core cases remain at 1%, 2% and 3% decline cutoffs. A 2018 baseline retains CBD professional services, finance and administration; North Melbourne professional services and Docklands hospitality replace construction and Southbank. The first three are consistent priorities across baselines. Construction and Southbank remain useful peer contrasts, with selection more dependent on the starting year.</w:t>
+        <w:t>The four core cases remain at 1%, 2% and 3% decline cutoffs. A 2018 baseline retains CBD professional services, finance and administration; North Melbourne professional services and Docklands hospitality replace construction and Southbank. The latter two remain informative contrasts, but their selection depends more on the baseline.</w:t>
       </w:r>
     </w:p>
     <w:p>
@@ -2205,7 +2205,7 @@
         <w:widowControl/>
       </w:pPr>
       <w:r>
-        <w:t>No-change has the lowest mean validation MAE. The tree and OLS have slightly lower validation RMSE, but no-change performs best on both measures in the separate 2022–2024 test (Table 3).</w:t>
+        <w:t>No-change wins on validation MAE and both test measures (Table 3). The tree and OLS have slightly lower validation RMSE. Selection follows the prespecified MAE criterion.</w:t>
       </w:r>
     </w:p>
     <w:tbl>
@@ -3106,7 +3106,7 @@
         <w:widowControl/>
       </w:pPr>
       <w:r>
-        <w:t>Around 80% of test groups changed by five or fewer establishments, favouring the no-change benchmark. Its MAE rises from 5.13 overall to 24.25 among the 24 groups starting with at least 100 establishments, although it still beats the fitted models. The CBD contributes 91% of its squared error.</w:t>
+        <w:t>Around 80% of test groups changed by five or fewer establishments, favouring no-change. Its MAE rises from 5.13 overall to 24.25 for the 24 groups starting with at least 100 establishments. The CBD contributes 91% of squared error.</w:t>
       </w:r>
     </w:p>
     <w:p>
@@ -3114,15 +3114,7 @@
         <w:widowControl/>
       </w:pPr>
       <w:r>
-        <w:t>The test sample gained 481 establishments. No-change predicted zero; fitted models predicted losses of 193–418. Low average group error therefore did not translate into a useful forecast of city recovery. Observed shortfalls and peer comparisons provide the stronger basis for our shortlist.</w:t>
-      </w:r>
-    </w:p>
-    <w:p>
-      <w:pPr>
-        <w:widowControl/>
-      </w:pPr>
-      <w:r>
-        <w:t>MAE weights every group equally. Reporting errors for large groups and city totals exposes weaknesses that the overall average conceals.</w:t>
+        <w:t>The matched sample gained 481 establishments, compared with 483 city-wide. No-change predicted zero; fitted models predicted losses of 193–418. Their historical relationships failed to capture the rebound. We therefore issue no 2026 forecast.</w:t>
       </w:r>
     </w:p>
     <w:p>
@@ -3154,12 +3146,29 @@
         <w:widowControl/>
       </w:pPr>
       <w:r>
-        <w:t>CBD professional services combines scale with repeated underperformance against peers. Construction and Southbank hospitality also lag recovering industries. Finance and administration share wider sector decline, calling for attention across precincts.</w:t>
+        <w:t>Recovery remains incomplete and uneven. Only 16.5% of the earlier loss has been recovered, and the CBD holds 65% of the remaining shortfall. Hospitality drives much of the rebound while several service industries continue to contract.</w:t>
       </w:r>
     </w:p>
     <w:p>
       <w:pPr>
+        <w:widowControl/>
+      </w:pPr>
+      <w:r>
+        <w:t>The five cases explain 35.7% of the remaining gap and kept shrinking while other groups grew. Figure 3 separates three locally weak cases from two sharing wider sector decline. CBD professional services combines the largest loss with repeated underperformance; construction and Southbank hospitality also lag recovering peers. Finance and administration require an industry-wide perspective.</w:t>
+      </w:r>
+    </w:p>
+    <w:p>
+      <w:pPr>
+        <w:widowControl/>
+      </w:pPr>
+      <w:r>
+        <w:t>These differences support targeted consultation and differentiated assistance. Tested forecasts add no reliable basis for ranking support needs: low average error concealed large-group errors and missed the city rebound. Observed losses and peer comparisons provide the stronger evidence.</w:t>
+      </w:r>
+    </w:p>
+    <w:p>
+      <w:pPr>
         <w:pStyle w:val="Heading2"/>
+        <w:pageBreakBefore/>
         <w:widowControl/>
       </w:pPr>
       <w:r>
@@ -3174,7 +3183,7 @@
         <w:widowControl/>
       </w:pPr>
       <w:r>
-        <w:t>Give small CBD professional-services practices first priority for targeted business advice and client-networking support (City of Melbourne, 2021, pp. 18–21). They account for 428 of the group’s 450-establishment shortfall, and the group remains selected under both baselines.</w:t>
+        <w:t>Prioritise consultation with small CBD professional-services practices and their industry representatives. They account for 428 of the 450-establishment gap, and the group remains selected under both baselines. Use these discussions to identify client-demand and operating pressures, then direct business advice and networking support to the needs reported (City of Melbourne, 2021, pp. 18–21).</w:t>
       </w:r>
     </w:p>
     <w:p>
@@ -3182,7 +3191,7 @@
         <w:widowControl/>
       </w:pPr>
       <w:r>
-        <w:t>For CBD construction, explore procurement connections and advice on accessing project opportunities for small contractors. Their continuing decline, alongside peer growth, supports a local focus on access to work.</w:t>
+        <w:t>For small CBD construction operators, consult contractor networks about access to projects and procurement processes. Their decline alongside peer growth warrants locally focused advice and connections to project opportunities.</w:t>
       </w:r>
     </w:p>
     <w:p>
@@ -3190,7 +3199,7 @@
         <w:widowControl/>
       </w:pPr>
       <w:r>
-        <w:t>For Southbank hospitality, consider precinct promotion or activation tied to local trading conditions (City of Melbourne, 2021, pp. 18–21). Its decline while hospitality expands elsewhere gives a clear reason to investigate local demand before selecting an activity.</w:t>
+        <w:t>For Southbank hospitality, work with local traders to identify weak trading periods and consider precinct promotion aligned with customer demand (City of Melbourne, 2021, pp. 18–21). Its contrast with recovering peers supports this local focus.</w:t>
       </w:r>
     </w:p>
     <w:p>
@@ -3198,13 +3207,13 @@
         <w:widowControl/>
       </w:pPr>
       <w:r>
-        <w:t>For finance and administration, coordinate business advice through industry bodies across precincts. Faster declines among peers suggest that CBD-only promotion would address too narrow a part of the problem.</w:t>
+        <w:t>For finance and administration, coordinate advice and networking through industry bodies across precincts. Declining peers indicate a broader sector problem. These are proposed support options; consultation should establish which barriers each option would address.</w:t>
       </w:r>
     </w:p>
     <w:p>
       <w:pPr>
         <w:pStyle w:val="Heading1"/>
-        <w:pageBreakBefore/>
+        <w:pageBreakBefore w:val="0"/>
         <w:widowControl/>
       </w:pPr>
       <w:r>
@@ -3231,7 +3240,7 @@
         <w:widowControl/>
       </w:pPr>
       <w:r>
-        <w:t>CLUE counts locations, not firms. Changes combine openings, closures, relocations and size-category movements, so they cannot identify firm survival. Unpublished cells remain unknown, and the survey cycle limits annual comparisons. Peer benchmarks establish relative performance; identifying its causes requires additional evidence.</w:t>
+        <w:t>CLUE counts locations, not firms; changes combine openings, closures, relocations and size-category movements. Unpublished cells remain unknown. Peer comparisons identify relative weakness, not its causes. Forecast evidence comes from one final test window, and case membership varies with the historical baseline.</w:t>
       </w:r>
     </w:p>
     <w:p>
@@ -3251,7 +3260,7 @@
         <w:widowControl/>
       </w:pPr>
       <w:r>
-        <w:t>Further research should explain why the locally weak groups diverge from recovering peers. For Southbank hospitality, compare pedestrian activity and, where available, spending with recovering precincts to assess whether weaker demand accompanies establishment losses. For CBD construction, examine project approvals and procurement opportunities alongside contractor counts. Interviews with small professional-services practices would distinguish client-demand pressures from rent costs or relocation decisions. These findings would help choose support that addresses the pressures businesses actually face.</w:t>
+        <w:t>For Southbank hospitality, compare pedestrian activity and spending with recovering precincts. Examine project approvals and procurement opportunities for CBD construction. Interviews with small professional-services practices could distinguish client-demand pressures from rent costs or relocation decisions, informing the choice of support.</w:t>
       </w:r>
     </w:p>
     <w:p>
@@ -3259,12 +3268,13 @@
         <w:widowControl/>
       </w:pPr>
       <w:r>
-        <w:t>For forecasting, test whether demand indicators improve two-year predictions using the same time-ordered validation and no-change benchmark. Only information available at the prediction date should enter each model. Assess large-group errors and city-wide growth alongside MAE, since the current benchmark missed the rebound. Later CLUE releases would provide a fresh test and show whether the five cases still warrant attention.</w:t>
+        <w:t>For forecasting, add demand indicators available at each prediction date and retain time-ordered validation against no-change. Evaluate large groups and city totals alongside MAE. Later CLUE releases would test whether the five cases remain priorities and whether forecast improvements persist.</w:t>
       </w:r>
     </w:p>
     <w:p>
       <w:pPr>
         <w:pStyle w:val="Heading1"/>
+        <w:pageBreakBefore/>
         <w:widowControl/>
       </w:pPr>
       <w:r>

</xml_diff>